<commit_message>
Add rebar frame assembly zero-rate rows to walls/lintels reports
</commit_message>
<xml_diff>
--- a/experiments/full_estimate_review_pipeline/reports/trc_vs_original_comparison/04_load_bearing_walls_lintels_p6_sources_for_elena.docx
+++ b/experiments/full_estimate_review_pipeline/reports/trc_vs_original_comparison/04_load_bearing_walls_lintels_p6_sources_for_elena.docx
@@ -858,6 +858,44 @@
           <w:p>
             <w:r>
               <w:t>То же самое, другой диаметр/класс из той же спецификации.</w:t>
+            </w:r>
+          </w:p>
+        </w:tc>
+      </w:tr>
+      <w:tr>
+        <w:tc>
+          <w:tcPr>
+            <w:tcW w:type="dxa" w:w="2880"/>
+          </w:tcPr>
+          <w:p>
+            <w:r>
+              <w:t>Изготовление и монтаж каркаса армирования перемычек</w:t>
+            </w:r>
+          </w:p>
+        </w:tc>
+        <w:tc>
+          <w:tcPr>
+            <w:tcW w:type="dxa" w:w="2880"/>
+          </w:tcPr>
+          <w:p>
+            <w:r>
+              <w:t>201 мп</w:t>
+            </w:r>
+          </w:p>
+        </w:tc>
+        <w:tc>
+          <w:tcPr>
+            <w:tcW w:type="dxa" w:w="2880"/>
+          </w:tcPr>
+          <w:p>
+            <w:r>
+              <w:rPr>
+                <w:b/>
+              </w:rPr>
+              <w:t>Посчитано.</w:t>
+            </w:r>
+            <w:r>
+              <w:t xml:space="preserve"> Сумма всей арматуры перемычек этой зоны выше (117+84=201). Ставка 0 ₽ — подтверждено на 3 реальных проектах (ТРЦ/АРК/ЮСВ): эта строка всегда есть у клиента с реальной ставкой, но всегда 0 по себестоимости.</w:t>
             </w:r>
           </w:p>
         </w:tc>
@@ -1802,6 +1840,44 @@
           <w:p>
             <w:r>
               <w:t>То же, хомуты той же спецификации.</w:t>
+            </w:r>
+          </w:p>
+        </w:tc>
+      </w:tr>
+      <w:tr>
+        <w:tc>
+          <w:tcPr>
+            <w:tcW w:type="dxa" w:w="2880"/>
+          </w:tcPr>
+          <w:p>
+            <w:r>
+              <w:t>Изготовление и монтаж каркаса армирования перемычек</w:t>
+            </w:r>
+          </w:p>
+        </w:tc>
+        <w:tc>
+          <w:tcPr>
+            <w:tcW w:type="dxa" w:w="2880"/>
+          </w:tcPr>
+          <w:p>
+            <w:r>
+              <w:t>177.3 мп</w:t>
+            </w:r>
+          </w:p>
+        </w:tc>
+        <w:tc>
+          <w:tcPr>
+            <w:tcW w:type="dxa" w:w="2880"/>
+          </w:tcPr>
+          <w:p>
+            <w:r>
+              <w:rPr>
+                <w:b/>
+              </w:rPr>
+              <w:t>Посчитано.</w:t>
+            </w:r>
+            <w:r>
+              <w:t xml:space="preserve"> Сумма всей арматуры перемычек этой зоны выше (11.7+93.6+72=177.3). Ставка 0 ₽, та же причина, что и на 1 этаже.</w:t>
             </w:r>
           </w:p>
         </w:tc>

</xml_diff>

<commit_message>
Fix 2 fabricated rows in sources-for-Elena doc, found by cross-checking column J
Verified every "Кол-во" value in the doc against the actual smeta's
column J (v3, after the zone-regrouping export fix) line by line.
30+ rows matched exactly. Found 2 real problems:

- "Резка/опалубка перемычек (доска 25мм)" (1.9 м² and 3.7 м², floor_1
  and floor_2) were presented as their own smeta rows with their own
  quantity - they aren't. total_formwork_area is a Python-only
  intermediate in the calculator (feeds plywood_qty/timber_volume),
  never wrapped in its own line(...) call. Folded the explanation into
  the Фанера/Пиломатериал rows that actually use it instead of
  claiming a row that doesn't exist.
- Minor arithmetic slip in the floor_2 delivery-truck note (89.65/32
  displayed as 2.83, should be 2.80 - final ceil(3) unaffected).

No other numeric errors found across the rest of the document.
</commit_message>
<xml_diff>
--- a/experiments/full_estimate_review_pipeline/reports/trc_vs_original_comparison/04_load_bearing_walls_lintels_p6_sources_for_elena.docx
+++ b/experiments/full_estimate_review_pipeline/reports/trc_vs_original_comparison/04_load_bearing_walls_lintels_p6_sources_for_elena.docx
@@ -685,44 +685,6 @@
           </w:tcPr>
           <w:p>
             <w:r>
-              <w:t>Резка/опалубка перемычек (доска 25мм)</w:t>
-            </w:r>
-          </w:p>
-        </w:tc>
-        <w:tc>
-          <w:tcPr>
-            <w:tcW w:type="dxa" w:w="2880"/>
-          </w:tcPr>
-          <w:p>
-            <w:r>
-              <w:t>1.9 м²</w:t>
-            </w:r>
-          </w:p>
-        </w:tc>
-        <w:tc>
-          <w:tcPr>
-            <w:tcW w:type="dxa" w:w="2880"/>
-          </w:tcPr>
-          <w:p>
-            <w:r>
-              <w:rPr>
-                <w:b/>
-              </w:rPr>
-              <w:t>Посчитано.</w:t>
-            </w:r>
-            <w:r>
-              <w:t xml:space="preserve"> Сумма площадей опалубки монолитной перемычки ПР-1;ПР-2 из спецификации (горизонтальная 0.5 м² + вертикальная 1.4 м²). Ставка 0 ₽ — входит в ставку бетонирования, база для фанеры/пиломатериала ниже.</w:t>
-            </w:r>
-          </w:p>
-        </w:tc>
-      </w:tr>
-      <w:tr>
-        <w:tc>
-          <w:tcPr>
-            <w:tcW w:type="dxa" w:w="2880"/>
-          </w:tcPr>
-          <w:p>
-            <w:r>
               <w:t>Фанера ФК 1.52×1.52 для опалубки перемычек</w:t>
             </w:r>
           </w:p>
@@ -749,7 +711,7 @@
               <w:t>Посчитано.</w:t>
             </w:r>
             <w:r>
-              <w:t xml:space="preserve"> 1.9 м² ÷ площадь листа (2.3 м²) = 0.83 → округление вверх = 1 лист.</w:t>
+              <w:t xml:space="preserve"> Площадь опалубки монолитной перемычки ПР-1;ПР-2 из спецификации (горизонтальная 0.5 м² + вертикальная 1.4 м² = 1.9 м², техническая промежуточная величина — своей строки в смете не имеет) ÷ площадь листа (2.3 м²) = 0.83 → округление вверх = 1 лист.</w:t>
             </w:r>
           </w:p>
         </w:tc>
@@ -787,7 +749,7 @@
               <w:t>Посчитано.</w:t>
             </w:r>
             <w:r>
-              <w:t xml:space="preserve"> 1.9 м² × толщина доски (0.05м) = 0.095 м³. ⚠️ У Елены на этой строке 0.2 м³ — открытый вопрос про минимальную партию доски, см. отдельное сообщение.</w:t>
+              <w:t xml:space="preserve"> Та же площадь опалубки 1.9 м² × толщина доски (0.05м) = 0.095 м³. ⚠️ У Елены на этой строке 0.2 м³ — открытый вопрос про минимальную партию доски, см. отдельное сообщение.</w:t>
             </w:r>
           </w:p>
         </w:tc>
@@ -1559,7 +1521,7 @@
               <w:t>Посчитано.</w:t>
             </w:r>
             <w:r>
-              <w:t xml:space="preserve"> Закупочный объём блоков 2 этажа + парапета + вентканалов пулится в одну партию доставки (реально возят вместе): (53.75+12.6+21.5+1.8) ÷ 32 = 2.83 → округление вверх = 3 машины.</w:t>
+              <w:t xml:space="preserve"> Закупочный объём блоков 2 этажа + парапета + вентканалов пулится в одну партию доставки (реально возят вместе): (53.75+12.6+21.5+1.8=89.65) ÷ 32 = 2.80 → округление вверх = 3 машины.</w:t>
             </w:r>
           </w:p>
         </w:tc>
@@ -1641,44 +1603,6 @@
           </w:tcPr>
           <w:p>
             <w:r>
-              <w:t>Опалубка перемычек (доска 25мм)</w:t>
-            </w:r>
-          </w:p>
-        </w:tc>
-        <w:tc>
-          <w:tcPr>
-            <w:tcW w:type="dxa" w:w="2880"/>
-          </w:tcPr>
-          <w:p>
-            <w:r>
-              <w:t>3.7 м²</w:t>
-            </w:r>
-          </w:p>
-        </w:tc>
-        <w:tc>
-          <w:tcPr>
-            <w:tcW w:type="dxa" w:w="2880"/>
-          </w:tcPr>
-          <w:p>
-            <w:r>
-              <w:rPr>
-                <w:b/>
-              </w:rPr>
-              <w:t>Посчитано.</w:t>
-            </w:r>
-            <w:r>
-              <w:t xml:space="preserve"> Опалубка монолитной перемычки ПР-3: горизонтальная (0.45 м²) + вертикальная (3.25 м²) = 3.7 м². Ставка 0 ₽, база для фанеры/пиломатериала.</w:t>
-            </w:r>
-          </w:p>
-        </w:tc>
-      </w:tr>
-      <w:tr>
-        <w:tc>
-          <w:tcPr>
-            <w:tcW w:type="dxa" w:w="2880"/>
-          </w:tcPr>
-          <w:p>
-            <w:r>
               <w:t>Фанера ФК опалубки перемычек</w:t>
             </w:r>
           </w:p>
@@ -1705,7 +1629,7 @@
               <w:t>Посчитано.</w:t>
             </w:r>
             <w:r>
-              <w:t xml:space="preserve"> 3.7 ÷ 2.3 = 1.61 → округление вверх = 2 листа.</w:t>
+              <w:t xml:space="preserve"> Площадь опалубки монолитной перемычки ПР-3 (горизонтальная 0.45 м² + вертикальная 3.25 м² = 3.7 м², техническая промежуточная величина — своей строки в смете не имеет) ÷ 2.3 = 1.61 → округление вверх = 2 листа.</w:t>
             </w:r>
           </w:p>
         </w:tc>
@@ -1743,7 +1667,7 @@
               <w:t>Посчитано.</w:t>
             </w:r>
             <w:r>
-              <w:t xml:space="preserve"> 3.7 × 0.05 = 0.185 м³.</w:t>
+              <w:t xml:space="preserve"> Та же площадь опалубки 3.7 м² × 0.05 = 0.185 м³.</w:t>
             </w:r>
           </w:p>
         </w:tc>

</xml_diff>

<commit_message>
Add real Монтаж опалубки перемычек row to sources-for-Elena doc (now a real line)
</commit_message>
<xml_diff>
--- a/experiments/full_estimate_review_pipeline/reports/trc_vs_original_comparison/04_load_bearing_walls_lintels_p6_sources_for_elena.docx
+++ b/experiments/full_estimate_review_pipeline/reports/trc_vs_original_comparison/04_load_bearing_walls_lintels_p6_sources_for_elena.docx
@@ -685,6 +685,44 @@
           </w:tcPr>
           <w:p>
             <w:r>
+              <w:t>Монтаж опалубки из доски для заливки перемычек</w:t>
+            </w:r>
+          </w:p>
+        </w:tc>
+        <w:tc>
+          <w:tcPr>
+            <w:tcW w:type="dxa" w:w="2880"/>
+          </w:tcPr>
+          <w:p>
+            <w:r>
+              <w:t>1.9 м²</w:t>
+            </w:r>
+          </w:p>
+        </w:tc>
+        <w:tc>
+          <w:tcPr>
+            <w:tcW w:type="dxa" w:w="2880"/>
+          </w:tcPr>
+          <w:p>
+            <w:r>
+              <w:rPr>
+                <w:b/>
+              </w:rPr>
+              <w:t>Посчитано.</w:t>
+            </w:r>
+            <w:r>
+              <w:t xml:space="preserve"> Сумма площадей опалубки монолитной перемычки ПР-1;ПР-2 из спецификации (горизонтальная 0.5 м² + вертикальная 1.4 м²). Ставка 0 ₽ — подтверждено на 3 реальных проектах (себестоимость всегда 0, работа входит в ставку бетонирования). Площадь — база для фанеры/пиломатериала ниже. Добавлено 16.08 — раньше эта строка вообще не эмитировалась.</w:t>
+            </w:r>
+          </w:p>
+        </w:tc>
+      </w:tr>
+      <w:tr>
+        <w:tc>
+          <w:tcPr>
+            <w:tcW w:type="dxa" w:w="2880"/>
+          </w:tcPr>
+          <w:p>
+            <w:r>
               <w:t>Фанера ФК 1.52×1.52 для опалубки перемычек</w:t>
             </w:r>
           </w:p>
@@ -711,7 +749,7 @@
               <w:t>Посчитано.</w:t>
             </w:r>
             <w:r>
-              <w:t xml:space="preserve"> Площадь опалубки монолитной перемычки ПР-1;ПР-2 из спецификации (горизонтальная 0.5 м² + вертикальная 1.4 м² = 1.9 м², техническая промежуточная величина — своей строки в смете не имеет) ÷ площадь листа (2.3 м²) = 0.83 → округление вверх = 1 лист.</w:t>
+              <w:t xml:space="preserve"> 1.9 м² ÷ площадь листа (2.3 м²) = 0.83 → округление вверх = 1 лист.</w:t>
             </w:r>
           </w:p>
         </w:tc>
@@ -749,7 +787,7 @@
               <w:t>Посчитано.</w:t>
             </w:r>
             <w:r>
-              <w:t xml:space="preserve"> Та же площадь опалубки 1.9 м² × толщина доски (0.05м) = 0.095 м³. ⚠️ У Елены на этой строке 0.2 м³ — открытый вопрос про минимальную партию доски, см. отдельное сообщение.</w:t>
+              <w:t xml:space="preserve"> 1.9 м² × толщина доски (0.05м) = 0.095 м³. ⚠️ У Елены на этой строке 0.2 м³ — открытый вопрос про минимальную партию доски, см. отдельное сообщение.</w:t>
             </w:r>
           </w:p>
         </w:tc>
@@ -1603,6 +1641,44 @@
           </w:tcPr>
           <w:p>
             <w:r>
+              <w:t>Монтаж опалубки из доски для заливки перемычек</w:t>
+            </w:r>
+          </w:p>
+        </w:tc>
+        <w:tc>
+          <w:tcPr>
+            <w:tcW w:type="dxa" w:w="2880"/>
+          </w:tcPr>
+          <w:p>
+            <w:r>
+              <w:t>3.7 м²</w:t>
+            </w:r>
+          </w:p>
+        </w:tc>
+        <w:tc>
+          <w:tcPr>
+            <w:tcW w:type="dxa" w:w="2880"/>
+          </w:tcPr>
+          <w:p>
+            <w:r>
+              <w:rPr>
+                <w:b/>
+              </w:rPr>
+              <w:t>Посчитано.</w:t>
+            </w:r>
+            <w:r>
+              <w:t xml:space="preserve"> Опалубка монолитной перемычки ПР-3: горизонтальная (0.45 м²) + вертикальная (3.25 м²) = 3.7 м². Ставка 0 ₽, база для фанеры/пиломатериала.</w:t>
+            </w:r>
+          </w:p>
+        </w:tc>
+      </w:tr>
+      <w:tr>
+        <w:tc>
+          <w:tcPr>
+            <w:tcW w:type="dxa" w:w="2880"/>
+          </w:tcPr>
+          <w:p>
+            <w:r>
               <w:t>Фанера ФК опалубки перемычек</w:t>
             </w:r>
           </w:p>
@@ -1629,7 +1705,7 @@
               <w:t>Посчитано.</w:t>
             </w:r>
             <w:r>
-              <w:t xml:space="preserve"> Площадь опалубки монолитной перемычки ПР-3 (горизонтальная 0.45 м² + вертикальная 3.25 м² = 3.7 м², техническая промежуточная величина — своей строки в смете не имеет) ÷ 2.3 = 1.61 → округление вверх = 2 листа.</w:t>
+              <w:t xml:space="preserve"> 3.7 ÷ 2.3 = 1.61 → округление вверх = 2 листа.</w:t>
             </w:r>
           </w:p>
         </w:tc>
@@ -1667,7 +1743,7 @@
               <w:t>Посчитано.</w:t>
             </w:r>
             <w:r>
-              <w:t xml:space="preserve"> Та же площадь опалубки 3.7 м² × 0.05 = 0.185 м³.</w:t>
+              <w:t xml:space="preserve"> 3.7 × 0.05 = 0.185 м³.</w:t>
             </w:r>
           </w:p>
         </w:tc>

</xml_diff>

<commit_message>
Update sources-for-Elena doc: adhesive pooled into one парапет+вентканалы line
</commit_message>
<xml_diff>
--- a/experiments/full_estimate_review_pipeline/reports/trc_vs_original_comparison/04_load_bearing_walls_lintels_p6_sources_for_elena.docx
+++ b/experiments/full_estimate_review_pipeline/reports/trc_vs_original_comparison/04_load_bearing_walls_lintels_p6_sources_for_elena.docx
@@ -2301,7 +2301,7 @@
           </w:tcPr>
           <w:p>
             <w:r>
-              <w:t>Монтажный клей для блоков (парапет)</w:t>
+              <w:t>Монтажный клей для блоков (парапет+вентканалы)</w:t>
             </w:r>
           </w:p>
         </w:tc>
@@ -2327,39 +2327,7 @@
               <w:t>Посчитано.</w:t>
             </w:r>
             <w:r>
-              <w:t xml:space="preserve"> 19.15 × 1.2 × 1.05 = 24.13 → округление вверх = 25 мешков.</w:t>
-            </w:r>
-          </w:p>
-        </w:tc>
-      </w:tr>
-      <w:tr>
-        <w:tc>
-          <w:tcPr>
-            <w:tcW w:type="dxa" w:w="2880"/>
-          </w:tcPr>
-          <w:p>
-            <w:r>
-              <w:t>Монтажный клей для блоков (вентканалы)</w:t>
-            </w:r>
-          </w:p>
-        </w:tc>
-        <w:tc>
-          <w:tcPr>
-            <w:tcW w:type="dxa" w:w="2880"/>
-          </w:tcPr>
-          <w:p>
-            <w:r>
-              <w:t>1 мешок</w:t>
-            </w:r>
-          </w:p>
-        </w:tc>
-        <w:tc>
-          <w:tcPr>
-            <w:tcW w:type="dxa" w:w="2880"/>
-          </w:tcPr>
-          <w:p>
-            <w:r>
-              <w:t>Отдельная строка у нас (своя зона), у Елены входит в общий клей выше — не расхождение по деньгам, просто другая раскладка строк.</w:t>
+              <w:t xml:space="preserve"> Объём парапета и вентканалов складывается ДО округления (19.15+0.66=19.81 м³) × 1.2 × 1.05 = 24.96 → округление вверх = 25 мешков, одной строкой — как у Елены. Исправлено 16.08: раньше считали раздельно (25+1=26 мешков, лишний мешок терялся на округлении маленького объёма вентканалов отдельно).</w:t>
             </w:r>
           </w:p>
         </w:tc>

</xml_diff>

<commit_message>
Add section-by-section YuSV review reports and sources-for-Elena docs
Line-by-line comparison reports against Elena's real delivered smeta for
earthworks, foundation_slab, waterproofing, walls/lintels, floor_slabs,
flat_roof, and schiedel_vent_channels, plus the matching
sources_for_elena.md/.docx explanation pairs (per the established workflow:
zone subheaders, Excel-style qty formatting, verified row-by-row against
column J/O of the real smeta). Also updates trc_vs_original_comparison's
foundation_slab and walls reports with corrections found during this pass,
and adds PRODUCTION_REHEARSAL_PLAN.md.

Co-Authored-By: Claude Sonnet 5 <noreply@anthropic.com>
</commit_message>
<xml_diff>
--- a/experiments/full_estimate_review_pipeline/reports/trc_vs_original_comparison/04_load_bearing_walls_lintels_p6_sources_for_elena.docx
+++ b/experiments/full_estimate_review_pipeline/reports/trc_vs_original_comparison/04_load_bearing_walls_lintels_p6_sources_for_elena.docx
@@ -799,6 +799,44 @@
           </w:tcPr>
           <w:p>
             <w:r>
+              <w:t>Изготовление и монтаж каркаса армирования перемычек</w:t>
+            </w:r>
+          </w:p>
+        </w:tc>
+        <w:tc>
+          <w:tcPr>
+            <w:tcW w:type="dxa" w:w="2880"/>
+          </w:tcPr>
+          <w:p>
+            <w:r>
+              <w:t>201 мп</w:t>
+            </w:r>
+          </w:p>
+        </w:tc>
+        <w:tc>
+          <w:tcPr>
+            <w:tcW w:type="dxa" w:w="2880"/>
+          </w:tcPr>
+          <w:p>
+            <w:r>
+              <w:rPr>
+                <w:b/>
+              </w:rPr>
+              <w:t>Посчитано.</w:t>
+            </w:r>
+            <w:r>
+              <w:t xml:space="preserve"> Сумма всей арматуры перемычек этой зоны ниже (117+84=201). Ставка 0 ₽ — подтверждено на 3 реальных проектах (ТРЦ/АРК/ЮСВ): эта строка всегда есть у клиента с реальной ставкой, но всегда 0 по себестоимости. Строка идёт ДО арматуры (не после) — так у Елены и так в нашей смете.</w:t>
+            </w:r>
+          </w:p>
+        </w:tc>
+      </w:tr>
+      <w:tr>
+        <w:tc>
+          <w:tcPr>
+            <w:tcW w:type="dxa" w:w="2880"/>
+          </w:tcPr>
+          <w:p>
+            <w:r>
               <w:t>Арматура А500С Ø12 (перемычки)</w:t>
             </w:r>
           </w:p>
@@ -858,44 +896,6 @@
           <w:p>
             <w:r>
               <w:t>То же самое, другой диаметр/класс из той же спецификации.</w:t>
-            </w:r>
-          </w:p>
-        </w:tc>
-      </w:tr>
-      <w:tr>
-        <w:tc>
-          <w:tcPr>
-            <w:tcW w:type="dxa" w:w="2880"/>
-          </w:tcPr>
-          <w:p>
-            <w:r>
-              <w:t>Изготовление и монтаж каркаса армирования перемычек</w:t>
-            </w:r>
-          </w:p>
-        </w:tc>
-        <w:tc>
-          <w:tcPr>
-            <w:tcW w:type="dxa" w:w="2880"/>
-          </w:tcPr>
-          <w:p>
-            <w:r>
-              <w:t>201 мп</w:t>
-            </w:r>
-          </w:p>
-        </w:tc>
-        <w:tc>
-          <w:tcPr>
-            <w:tcW w:type="dxa" w:w="2880"/>
-          </w:tcPr>
-          <w:p>
-            <w:r>
-              <w:rPr>
-                <w:b/>
-              </w:rPr>
-              <w:t>Посчитано.</w:t>
-            </w:r>
-            <w:r>
-              <w:t xml:space="preserve"> Сумма всей арматуры перемычек этой зоны выше (117+84=201). Ставка 0 ₽ — подтверждено на 3 реальных проектах (ТРЦ/АРК/ЮСВ): эта строка всегда есть у клиента с реальной ставкой, но всегда 0 по себестоимости.</w:t>
             </w:r>
           </w:p>
         </w:tc>
@@ -1755,6 +1755,44 @@
           </w:tcPr>
           <w:p>
             <w:r>
+              <w:t>Изготовление и монтаж каркаса армирования перемычек</w:t>
+            </w:r>
+          </w:p>
+        </w:tc>
+        <w:tc>
+          <w:tcPr>
+            <w:tcW w:type="dxa" w:w="2880"/>
+          </w:tcPr>
+          <w:p>
+            <w:r>
+              <w:t>177.3 мп</w:t>
+            </w:r>
+          </w:p>
+        </w:tc>
+        <w:tc>
+          <w:tcPr>
+            <w:tcW w:type="dxa" w:w="2880"/>
+          </w:tcPr>
+          <w:p>
+            <w:r>
+              <w:rPr>
+                <w:b/>
+              </w:rPr>
+              <w:t>Посчитано.</w:t>
+            </w:r>
+            <w:r>
+              <w:t xml:space="preserve"> Сумма всей арматуры перемычек этой зоны ниже (11.7+93.6+72=177.3). Ставка 0 ₽, та же причина, что и на 1 этаже. Строка идёт ДО арматуры — та же логика порядка, что на 1 этаже.</w:t>
+            </w:r>
+          </w:p>
+        </w:tc>
+      </w:tr>
+      <w:tr>
+        <w:tc>
+          <w:tcPr>
+            <w:tcW w:type="dxa" w:w="2880"/>
+          </w:tcPr>
+          <w:p>
+            <w:r>
               <w:t>Арматура А500С Ø16 (перемычки)</w:t>
             </w:r>
           </w:p>
@@ -1840,44 +1878,6 @@
           <w:p>
             <w:r>
               <w:t>То же, хомуты той же спецификации.</w:t>
-            </w:r>
-          </w:p>
-        </w:tc>
-      </w:tr>
-      <w:tr>
-        <w:tc>
-          <w:tcPr>
-            <w:tcW w:type="dxa" w:w="2880"/>
-          </w:tcPr>
-          <w:p>
-            <w:r>
-              <w:t>Изготовление и монтаж каркаса армирования перемычек</w:t>
-            </w:r>
-          </w:p>
-        </w:tc>
-        <w:tc>
-          <w:tcPr>
-            <w:tcW w:type="dxa" w:w="2880"/>
-          </w:tcPr>
-          <w:p>
-            <w:r>
-              <w:t>177.3 мп</w:t>
-            </w:r>
-          </w:p>
-        </w:tc>
-        <w:tc>
-          <w:tcPr>
-            <w:tcW w:type="dxa" w:w="2880"/>
-          </w:tcPr>
-          <w:p>
-            <w:r>
-              <w:rPr>
-                <w:b/>
-              </w:rPr>
-              <w:t>Посчитано.</w:t>
-            </w:r>
-            <w:r>
-              <w:t xml:space="preserve"> Сумма всей арматуры перемычек этой зоны выше (11.7+93.6+72=177.3). Ставка 0 ₽, та же причина, что и на 1 этаже.</w:t>
             </w:r>
           </w:p>
         </w:tc>

</xml_diff>